<commit_message>
New site fixes - Wed Jun 30 19:32:34 UTC 2021
</commit_message>
<xml_diff>
--- a/web/index.docx
+++ b/web/index.docx
@@ -44,7 +44,7 @@
         <w:t xml:space="preserve">Contact details</w:t>
       </w:r>
       <w:r>
-        <w:t xml:space="preserve">: stefanos1316 at gmail dot com, first name dot family name at queensu dot com</w:t>
+        <w:t xml:space="preserve">: first name 1316 at gmail dot com, first name dot family name at queensu dot com</w:t>
       </w:r>
     </w:p>
     <w:p>
@@ -58,7 +58,7 @@
         <w:t xml:space="preserve">About me</w:t>
       </w:r>
       <w:r>
-        <w:t xml:space="preserve">: I am passionated with</w:t>
+        <w:t xml:space="preserve">: I am passionated with research,</w:t>
       </w:r>
       <w:r>
         <w:t xml:space="preserve"> </w:t>
@@ -72,7 +72,7 @@
         </w:r>
       </w:hyperlink>
       <w:r>
-        <w:t xml:space="preserve">, empirical studies, integrating new technologies, and automating cumbersome tasks. I enjoy working on the command-line and especially with Linux systems. I love to create small, indepentant componets and tools to facilitate different daily functionalities. On my free time, I enjoy sporting, reading books, and</w:t>
+        <w:t xml:space="preserve">, integrating new technologies, and automating cumbersome tasks. My research interests lie to Green and Energy-Efficient Computing, Mining Software Repositories, and Machine Learning. I enjoy working on the command-line and especially with Linux systems. I love to create small indepentant componets and tools to facilitate different daily functionalities. On my free time, I enjoy sporting, reading books, and</w:t>
       </w:r>
       <w:r>
         <w:t xml:space="preserve"> </w:t>
@@ -213,10 +213,7 @@
         <w:pStyle w:val="Definition"/>
       </w:pPr>
       <w:r>
-        <w:t xml:space="preserve">PhD advisors:</w:t>
-      </w:r>
-      <w:r>
-        <w:t xml:space="preserve"> </w:t>
+        <w:t xml:space="preserve">PhD advisors: (Main)</w:t>
       </w:r>
       <w:hyperlink r:id="rId26">
         <w:r>
@@ -227,10 +224,7 @@
         </w:r>
       </w:hyperlink>
       <w:r>
-        <w:t xml:space="preserve"> </w:t>
-      </w:r>
-      <w:r>
-        <w:t xml:space="preserve">and</w:t>
+        <w:t xml:space="preserve">,</w:t>
       </w:r>
       <w:r>
         <w:t xml:space="preserve"> </w:t>
@@ -241,6 +235,20 @@
             <w:rStyle w:val="Hyperlink"/>
           </w:rPr>
           <w:t xml:space="preserve">Prof. Panos Louridas</w:t>
+        </w:r>
+      </w:hyperlink>
+      <w:r>
+        <w:t xml:space="preserve">, and</w:t>
+      </w:r>
+      <w:r>
+        <w:t xml:space="preserve"> </w:t>
+      </w:r>
+      <w:hyperlink r:id="rId28">
+        <w:r>
+          <w:rPr>
+            <w:rStyle w:val="Hyperlink"/>
+          </w:rPr>
+          <w:t xml:space="preserve">Rizos Sakellariou</w:t>
         </w:r>
       </w:hyperlink>
     </w:p>
@@ -288,7 +296,7 @@
       <w:r>
         <w:t xml:space="preserve"> </w:t>
       </w:r>
-      <w:hyperlink r:id="rId28">
+      <w:hyperlink r:id="rId29">
         <w:r>
           <w:rPr>
             <w:rStyle w:val="Hyperlink"/>
@@ -316,7 +324,7 @@
       <w:r>
         <w:t xml:space="preserve"> </w:t>
       </w:r>
-      <w:hyperlink r:id="rId29">
+      <w:hyperlink r:id="rId30">
         <w:r>
           <w:rPr>
             <w:rStyle w:val="Hyperlink"/>
@@ -344,7 +352,7 @@
       <w:r>
         <w:t xml:space="preserve"> </w:t>
       </w:r>
-      <w:hyperlink r:id="rId30">
+      <w:hyperlink r:id="rId31">
         <w:r>
           <w:rPr>
             <w:rStyle w:val="Hyperlink"/>
@@ -372,7 +380,7 @@
       <w:r>
         <w:t xml:space="preserve"> </w:t>
       </w:r>
-      <w:hyperlink r:id="rId31">
+      <w:hyperlink r:id="rId32">
         <w:r>
           <w:rPr>
             <w:rStyle w:val="Hyperlink"/>
@@ -425,7 +433,7 @@
       <w:r>
         <w:t xml:space="preserve"> </w:t>
       </w:r>
-      <w:hyperlink r:id="rId32">
+      <w:hyperlink r:id="rId33">
         <w:r>
           <w:rPr>
             <w:rStyle w:val="Hyperlink"/>
@@ -438,11 +446,11 @@
       <w:pPr>
         <w:pStyle w:val="Heading2"/>
       </w:pPr>
-      <w:bookmarkStart w:id="33" w:name="industrial-experience"/>
+      <w:bookmarkStart w:id="34" w:name="industrial-experience"/>
       <w:r>
         <w:t xml:space="preserve">Industrial Experience</w:t>
       </w:r>
-      <w:bookmarkEnd w:id="33"/>
+      <w:bookmarkEnd w:id="34"/>
     </w:p>
     <w:p>
       <w:pPr>
@@ -465,7 +473,7 @@
       <w:r>
         <w:t xml:space="preserve"> </w:t>
       </w:r>
-      <w:hyperlink r:id="rId34">
+      <w:hyperlink r:id="rId35">
         <w:r>
           <w:rPr>
             <w:rStyle w:val="Hyperlink"/>
@@ -484,7 +492,7 @@
       <w:r>
         <w:t xml:space="preserve"> </w:t>
       </w:r>
-      <w:hyperlink r:id="rId35">
+      <w:hyperlink r:id="rId36">
         <w:r>
           <w:rPr>
             <w:rStyle w:val="Hyperlink"/>
@@ -495,7 +503,7 @@
       <w:r>
         <w:t xml:space="preserve"> </w:t>
       </w:r>
-      <w:hyperlink r:id="rId36">
+      <w:hyperlink r:id="rId37">
         <w:r>
           <w:rPr>
             <w:rStyle w:val="Hyperlink"/>
@@ -527,7 +535,7 @@
       <w:r>
         <w:t xml:space="preserve"> </w:t>
       </w:r>
-      <w:hyperlink r:id="rId37">
+      <w:hyperlink r:id="rId38">
         <w:r>
           <w:rPr>
             <w:rStyle w:val="Hyperlink"/>
@@ -541,7 +549,7 @@
       <w:r>
         <w:t xml:space="preserve"> </w:t>
       </w:r>
-      <w:hyperlink r:id="rId38">
+      <w:hyperlink r:id="rId39">
         <w:r>
           <w:rPr>
             <w:rStyle w:val="Hyperlink"/>
@@ -555,7 +563,7 @@
       <w:r>
         <w:t xml:space="preserve"> </w:t>
       </w:r>
-      <w:hyperlink r:id="rId39">
+      <w:hyperlink r:id="rId40">
         <w:r>
           <w:rPr>
             <w:rStyle w:val="Hyperlink"/>
@@ -600,7 +608,7 @@
       <w:r>
         <w:t xml:space="preserve"> </w:t>
       </w:r>
-      <w:hyperlink r:id="rId40">
+      <w:hyperlink r:id="rId41">
         <w:r>
           <w:rPr>
             <w:rStyle w:val="Hyperlink"/>
@@ -619,7 +627,7 @@
       <w:r>
         <w:t xml:space="preserve"> </w:t>
       </w:r>
-      <w:hyperlink r:id="rId41">
+      <w:hyperlink r:id="rId42">
         <w:r>
           <w:rPr>
             <w:rStyle w:val="Hyperlink"/>
@@ -651,7 +659,7 @@
       <w:r>
         <w:t xml:space="preserve">Development of API end-points in JavaScript (</w:t>
       </w:r>
-      <w:hyperlink r:id="rId42">
+      <w:hyperlink r:id="rId43">
         <w:r>
           <w:rPr>
             <w:rStyle w:val="Hyperlink"/>
@@ -665,7 +673,7 @@
       <w:r>
         <w:t xml:space="preserve"> </w:t>
       </w:r>
-      <w:hyperlink r:id="rId43">
+      <w:hyperlink r:id="rId44">
         <w:r>
           <w:rPr>
             <w:rStyle w:val="Hyperlink"/>
@@ -691,7 +699,7 @@
       <w:r>
         <w:t xml:space="preserve"> </w:t>
       </w:r>
-      <w:hyperlink r:id="rId44">
+      <w:hyperlink r:id="rId45">
         <w:r>
           <w:rPr>
             <w:rStyle w:val="Hyperlink"/>
@@ -708,7 +716,7 @@
       <w:r>
         <w:t xml:space="preserve"> </w:t>
       </w:r>
-      <w:hyperlink r:id="rId45">
+      <w:hyperlink r:id="rId46">
         <w:r>
           <w:rPr>
             <w:rStyle w:val="Hyperlink"/>
@@ -725,7 +733,7 @@
       <w:r>
         <w:t xml:space="preserve"> </w:t>
       </w:r>
-      <w:hyperlink r:id="rId46">
+      <w:hyperlink r:id="rId47">
         <w:r>
           <w:rPr>
             <w:rStyle w:val="Hyperlink"/>
@@ -745,7 +753,7 @@
       <w:r>
         <w:t xml:space="preserve"> </w:t>
       </w:r>
-      <w:hyperlink r:id="rId47">
+      <w:hyperlink r:id="rId48">
         <w:r>
           <w:rPr>
             <w:rStyle w:val="Hyperlink"/>
@@ -759,7 +767,7 @@
       <w:r>
         <w:t xml:space="preserve"> </w:t>
       </w:r>
-      <w:hyperlink r:id="rId48">
+      <w:hyperlink r:id="rId49">
         <w:r>
           <w:rPr>
             <w:rStyle w:val="Hyperlink"/>
@@ -773,7 +781,7 @@
       <w:r>
         <w:t xml:space="preserve"> </w:t>
       </w:r>
-      <w:hyperlink r:id="rId49">
+      <w:hyperlink r:id="rId50">
         <w:r>
           <w:rPr>
             <w:rStyle w:val="Hyperlink"/>
@@ -793,7 +801,7 @@
       <w:r>
         <w:t xml:space="preserve"> </w:t>
       </w:r>
-      <w:hyperlink r:id="rId50">
+      <w:hyperlink r:id="rId51">
         <w:r>
           <w:rPr>
             <w:rStyle w:val="Hyperlink"/>
@@ -810,7 +818,7 @@
       <w:r>
         <w:t xml:space="preserve"> </w:t>
       </w:r>
-      <w:hyperlink r:id="rId51">
+      <w:hyperlink r:id="rId52">
         <w:r>
           <w:rPr>
             <w:rStyle w:val="Hyperlink"/>
@@ -846,7 +854,7 @@
       <w:r>
         <w:t xml:space="preserve"> </w:t>
       </w:r>
-      <w:hyperlink r:id="rId52">
+      <w:hyperlink r:id="rId53">
         <w:r>
           <w:rPr>
             <w:rStyle w:val="Hyperlink"/>
@@ -865,7 +873,7 @@
       <w:r>
         <w:t xml:space="preserve"> </w:t>
       </w:r>
-      <w:hyperlink r:id="rId53">
+      <w:hyperlink r:id="rId54">
         <w:r>
           <w:rPr>
             <w:rStyle w:val="Hyperlink"/>
@@ -899,11 +907,11 @@
       <w:pPr>
         <w:pStyle w:val="Heading2"/>
       </w:pPr>
-      <w:bookmarkStart w:id="54" w:name="technical-experience"/>
+      <w:bookmarkStart w:id="55" w:name="technical-experience"/>
       <w:r>
         <w:t xml:space="preserve">Technical Experience</w:t>
       </w:r>
-      <w:bookmarkEnd w:id="54"/>
+      <w:bookmarkEnd w:id="55"/>
     </w:p>
     <w:p>
       <w:pPr>
@@ -978,7 +986,7 @@
       <w:r>
         <w:t xml:space="preserve">MongoDB (</w:t>
       </w:r>
-      <w:hyperlink r:id="rId55">
+      <w:hyperlink r:id="rId56">
         <w:r>
           <w:rPr>
             <w:rStyle w:val="Hyperlink"/>
@@ -992,7 +1000,7 @@
       <w:r>
         <w:t xml:space="preserve"> </w:t>
       </w:r>
-      <w:hyperlink r:id="rId56">
+      <w:hyperlink r:id="rId57">
         <w:r>
           <w:rPr>
             <w:rStyle w:val="Hyperlink"/>
@@ -1006,7 +1014,7 @@
       <w:r>
         <w:t xml:space="preserve"> </w:t>
       </w:r>
-      <w:hyperlink r:id="rId57">
+      <w:hyperlink r:id="rId58">
         <w:r>
           <w:rPr>
             <w:rStyle w:val="Hyperlink"/>
@@ -1020,7 +1028,7 @@
       <w:r>
         <w:t xml:space="preserve"> </w:t>
       </w:r>
-      <w:hyperlink r:id="rId58">
+      <w:hyperlink r:id="rId59">
         <w:r>
           <w:rPr>
             <w:rStyle w:val="Hyperlink"/>
@@ -1110,7 +1118,7 @@
       <w:r>
         <w:t xml:space="preserve"> </w:t>
       </w:r>
-      <w:hyperlink r:id="rId59">
+      <w:hyperlink r:id="rId60">
         <w:r>
           <w:rPr>
             <w:rStyle w:val="Hyperlink"/>
@@ -1130,7 +1138,7 @@
       <w:r>
         <w:t xml:space="preserve"> </w:t>
       </w:r>
-      <w:hyperlink r:id="rId60">
+      <w:hyperlink r:id="rId61">
         <w:r>
           <w:rPr>
             <w:rStyle w:val="Hyperlink"/>
@@ -1150,7 +1158,7 @@
       <w:r>
         <w:t xml:space="preserve"> </w:t>
       </w:r>
-      <w:hyperlink r:id="rId61">
+      <w:hyperlink r:id="rId62">
         <w:r>
           <w:rPr>
             <w:rStyle w:val="Hyperlink"/>
@@ -1167,7 +1175,7 @@
       <w:r>
         <w:t xml:space="preserve"> </w:t>
       </w:r>
-      <w:hyperlink r:id="rId62">
+      <w:hyperlink r:id="rId63">
         <w:r>
           <w:rPr>
             <w:rStyle w:val="Hyperlink"/>
@@ -1193,7 +1201,7 @@
       <w:r>
         <w:t xml:space="preserve"> </w:t>
       </w:r>
-      <w:hyperlink r:id="rId63">
+      <w:hyperlink r:id="rId64">
         <w:r>
           <w:rPr>
             <w:rStyle w:val="Hyperlink"/>
@@ -1213,7 +1221,7 @@
       <w:r>
         <w:t xml:space="preserve"> </w:t>
       </w:r>
-      <w:hyperlink r:id="rId64">
+      <w:hyperlink r:id="rId65">
         <w:r>
           <w:rPr>
             <w:rStyle w:val="Hyperlink"/>
@@ -1233,7 +1241,7 @@
       <w:r>
         <w:t xml:space="preserve"> </w:t>
       </w:r>
-      <w:hyperlink r:id="rId65">
+      <w:hyperlink r:id="rId66">
         <w:r>
           <w:rPr>
             <w:rStyle w:val="Hyperlink"/>
@@ -1264,7 +1272,7 @@
       <w:r>
         <w:t xml:space="preserve"> </w:t>
       </w:r>
-      <w:hyperlink r:id="rId66">
+      <w:hyperlink r:id="rId67">
         <w:r>
           <w:rPr>
             <w:rStyle w:val="Hyperlink"/>
@@ -1295,7 +1303,7 @@
       <w:r>
         <w:t xml:space="preserve"> </w:t>
       </w:r>
-      <w:hyperlink r:id="rId67">
+      <w:hyperlink r:id="rId68">
         <w:r>
           <w:rPr>
             <w:rStyle w:val="Hyperlink"/>
@@ -1309,7 +1317,7 @@
       <w:r>
         <w:t xml:space="preserve"> </w:t>
       </w:r>
-      <w:hyperlink r:id="rId56">
+      <w:hyperlink r:id="rId57">
         <w:r>
           <w:rPr>
             <w:rStyle w:val="Hyperlink"/>
@@ -1323,7 +1331,7 @@
       <w:r>
         <w:t xml:space="preserve"> </w:t>
       </w:r>
-      <w:hyperlink r:id="rId57">
+      <w:hyperlink r:id="rId58">
         <w:r>
           <w:rPr>
             <w:rStyle w:val="Hyperlink"/>
@@ -1337,7 +1345,7 @@
       <w:r>
         <w:t xml:space="preserve"> </w:t>
       </w:r>
-      <w:hyperlink r:id="rId58">
+      <w:hyperlink r:id="rId59">
         <w:r>
           <w:rPr>
             <w:rStyle w:val="Hyperlink"/>
@@ -1366,11 +1374,11 @@
       <w:pPr>
         <w:pStyle w:val="Heading2"/>
       </w:pPr>
-      <w:bookmarkStart w:id="68" w:name="research-publications"/>
+      <w:bookmarkStart w:id="69" w:name="research-publications"/>
       <w:r>
         <w:t xml:space="preserve">Research Publications</w:t>
       </w:r>
-      <w:bookmarkEnd w:id="68"/>
+      <w:bookmarkEnd w:id="69"/>
     </w:p>
     <w:p>
       <w:pPr>
@@ -1410,7 +1418,7 @@
       <w:r>
         <w:t xml:space="preserve">[</w:t>
       </w:r>
-      <w:hyperlink r:id="rId69">
+      <w:hyperlink r:id="rId70">
         <w:r>
           <w:rPr>
             <w:rStyle w:val="Hyperlink"/>
@@ -1421,7 +1429,7 @@
       <w:r>
         <w:t xml:space="preserve">] [</w:t>
       </w:r>
-      <w:hyperlink r:id="rId70">
+      <w:hyperlink r:id="rId71">
         <w:r>
           <w:rPr>
             <w:rStyle w:val="Hyperlink"/>
@@ -1432,7 +1440,7 @@
       <w:r>
         <w:t xml:space="preserve">] [</w:t>
       </w:r>
-      <w:hyperlink r:id="rId71">
+      <w:hyperlink r:id="rId72">
         <w:r>
           <w:rPr>
             <w:rStyle w:val="Hyperlink"/>
@@ -1443,7 +1451,7 @@
       <w:r>
         <w:t xml:space="preserve">] [</w:t>
       </w:r>
-      <w:hyperlink r:id="rId64">
+      <w:hyperlink r:id="rId65">
         <w:r>
           <w:rPr>
             <w:rStyle w:val="Hyperlink"/>
@@ -1481,7 +1489,7 @@
       <w:r>
         <w:t xml:space="preserve">[</w:t>
       </w:r>
-      <w:hyperlink r:id="rId72">
+      <w:hyperlink r:id="rId73">
         <w:r>
           <w:rPr>
             <w:rStyle w:val="Hyperlink"/>
@@ -1492,7 +1500,7 @@
       <w:r>
         <w:t xml:space="preserve">] [</w:t>
       </w:r>
-      <w:hyperlink r:id="rId73">
+      <w:hyperlink r:id="rId74">
         <w:r>
           <w:rPr>
             <w:rStyle w:val="Hyperlink"/>
@@ -1503,7 +1511,7 @@
       <w:r>
         <w:t xml:space="preserve">] [</w:t>
       </w:r>
-      <w:hyperlink r:id="rId74">
+      <w:hyperlink r:id="rId75">
         <w:r>
           <w:rPr>
             <w:rStyle w:val="Hyperlink"/>
@@ -1514,7 +1522,7 @@
       <w:r>
         <w:t xml:space="preserve">] [</w:t>
       </w:r>
-      <w:hyperlink r:id="rId64">
+      <w:hyperlink r:id="rId65">
         <w:r>
           <w:rPr>
             <w:rStyle w:val="Hyperlink"/>
@@ -1585,7 +1593,7 @@
       <w:r>
         <w:t xml:space="preserve">[</w:t>
       </w:r>
-      <w:hyperlink r:id="rId75">
+      <w:hyperlink r:id="rId76">
         <w:r>
           <w:rPr>
             <w:rStyle w:val="Hyperlink"/>
@@ -1596,7 +1604,7 @@
       <w:r>
         <w:t xml:space="preserve">] [</w:t>
       </w:r>
-      <w:hyperlink r:id="rId76">
+      <w:hyperlink r:id="rId77">
         <w:r>
           <w:rPr>
             <w:rStyle w:val="Hyperlink"/>
@@ -1634,7 +1642,7 @@
       <w:r>
         <w:t xml:space="preserve">[</w:t>
       </w:r>
-      <w:hyperlink r:id="rId77">
+      <w:hyperlink r:id="rId78">
         <w:r>
           <w:rPr>
             <w:rStyle w:val="Hyperlink"/>
@@ -1645,7 +1653,7 @@
       <w:r>
         <w:t xml:space="preserve">] [</w:t>
       </w:r>
-      <w:hyperlink r:id="rId78">
+      <w:hyperlink r:id="rId79">
         <w:r>
           <w:rPr>
             <w:rStyle w:val="Hyperlink"/>
@@ -1661,11 +1669,11 @@
       <w:pPr>
         <w:pStyle w:val="Heading2"/>
       </w:pPr>
-      <w:bookmarkStart w:id="79" w:name="invited-talks"/>
+      <w:bookmarkStart w:id="80" w:name="invited-talks"/>
       <w:r>
         <w:t xml:space="preserve">Invited Talks</w:t>
       </w:r>
-      <w:bookmarkEnd w:id="79"/>
+      <w:bookmarkEnd w:id="80"/>
     </w:p>
     <w:p>
       <w:pPr>
@@ -1695,7 +1703,7 @@
       <w:r>
         <w:t xml:space="preserve"> </w:t>
       </w:r>
-      <w:hyperlink r:id="rId80">
+      <w:hyperlink r:id="rId81">
         <w:r>
           <w:rPr>
             <w:rStyle w:val="Hyperlink"/>
@@ -1724,7 +1732,7 @@
       <w:r>
         <w:t xml:space="preserve"> </w:t>
       </w:r>
-      <w:hyperlink r:id="rId81">
+      <w:hyperlink r:id="rId82">
         <w:r>
           <w:rPr>
             <w:rStyle w:val="Hyperlink"/>
@@ -1761,7 +1769,7 @@
       <w:r>
         <w:t xml:space="preserve"> </w:t>
       </w:r>
-      <w:hyperlink r:id="rId82">
+      <w:hyperlink r:id="rId83">
         <w:r>
           <w:rPr>
             <w:rStyle w:val="Hyperlink"/>
@@ -1774,11 +1782,11 @@
       <w:pPr>
         <w:pStyle w:val="Heading2"/>
       </w:pPr>
-      <w:bookmarkStart w:id="83" w:name="teaching-experience"/>
+      <w:bookmarkStart w:id="84" w:name="teaching-experience"/>
       <w:r>
         <w:t xml:space="preserve">Teaching Experience</w:t>
       </w:r>
-      <w:bookmarkEnd w:id="83"/>
+      <w:bookmarkEnd w:id="84"/>
     </w:p>
     <w:p>
       <w:pPr>
@@ -1787,7 +1795,7 @@
       <w:r>
         <w:t xml:space="preserve">Assisting my PhD advisor at Programming II course (Winter Semester of 2016, 2017, and 2018) by giving tutorial and Lab sessions in Java [</w:t>
       </w:r>
-      <w:hyperlink r:id="rId84">
+      <w:hyperlink r:id="rId85">
         <w:r>
           <w:rPr>
             <w:rStyle w:val="Hyperlink"/>
@@ -1815,7 +1823,7 @@
       <w:r>
         <w:t xml:space="preserve">[</w:t>
       </w:r>
-      <w:hyperlink r:id="rId85">
+      <w:hyperlink r:id="rId86">
         <w:r>
           <w:rPr>
             <w:rStyle w:val="Hyperlink"/>
@@ -1826,7 +1834,7 @@
       <w:r>
         <w:t xml:space="preserve">] [</w:t>
       </w:r>
-      <w:hyperlink r:id="rId86">
+      <w:hyperlink r:id="rId87">
         <w:r>
           <w:rPr>
             <w:rStyle w:val="Hyperlink"/>
@@ -1842,11 +1850,11 @@
       <w:pPr>
         <w:pStyle w:val="Heading2"/>
       </w:pPr>
-      <w:bookmarkStart w:id="87" w:name="organization-services"/>
+      <w:bookmarkStart w:id="88" w:name="organization-services"/>
       <w:r>
         <w:t xml:space="preserve">Organization Services</w:t>
       </w:r>
-      <w:bookmarkEnd w:id="87"/>
+      <w:bookmarkEnd w:id="88"/>
     </w:p>
     <w:p>
       <w:pPr>
@@ -1865,7 +1873,16 @@
         <w:pStyle w:val="Definition"/>
       </w:pPr>
       <w:r>
-        <w:t xml:space="preserve">International Workshop on Sustainable Software Engineering</w:t>
+        <w:t xml:space="preserve">ESEC/FSE 2020 at Student Research Competition</w:t>
+      </w:r>
+    </w:p>
+    <w:p>
+      <w:pPr>
+        <w:pStyle w:val="Compact"/>
+        <w:pStyle w:val="Definition"/>
+      </w:pPr>
+      <w:r>
+        <w:t xml:space="preserve">International Workshop on Sustainable Software Engineering 2020</w:t>
       </w:r>
     </w:p>
     <w:p>
@@ -1885,7 +1902,25 @@
         <w:pStyle w:val="Definition"/>
       </w:pPr>
       <w:r>
-        <w:t xml:space="preserve">Jounals submitted to Software: Practices and Experience</w:t>
+        <w:t xml:space="preserve">Journals submitted to Software: Practices and Experience</w:t>
+      </w:r>
+    </w:p>
+    <w:p>
+      <w:pPr>
+        <w:pStyle w:val="Compact"/>
+        <w:pStyle w:val="Definition"/>
+      </w:pPr>
+      <w:r>
+        <w:t xml:space="preserve">Journals submitted to ACM Computing Surveys (CSUR)</w:t>
+      </w:r>
+    </w:p>
+    <w:p>
+      <w:pPr>
+        <w:pStyle w:val="Compact"/>
+        <w:pStyle w:val="Definition"/>
+      </w:pPr>
+      <w:r>
+        <w:t xml:space="preserve">Research papers submitted to ESEC/FSE</w:t>
       </w:r>
     </w:p>
     <w:p>
@@ -1912,11 +1947,11 @@
       <w:pPr>
         <w:pStyle w:val="Heading2"/>
       </w:pPr>
-      <w:bookmarkStart w:id="88" w:name="X0b9b8d5ab941db81b7b9535ce1a187e63fa3866"/>
-      <w:r>
-        <w:t xml:space="preserve">Grands, Awards, Languages, and Living Abroad</w:t>
-      </w:r>
-      <w:bookmarkEnd w:id="88"/>
+      <w:bookmarkStart w:id="89" w:name="X9be22b774a5c8db00a5c7e861fb8f8ad2904c89"/>
+      <w:r>
+        <w:t xml:space="preserve">Grands, Awards, Achievements, Languages, and Living Abroad</w:t>
+      </w:r>
+      <w:bookmarkEnd w:id="89"/>
     </w:p>
     <w:p>
       <w:pPr>
@@ -1938,26 +1973,14 @@
           <w:ilvl w:val="1"/>
         </w:numPr>
       </w:pPr>
-      <w:r>
-        <w:t xml:space="preserve">Mentored younger researcher</w:t>
-      </w:r>
-      <w:r>
-        <w:t xml:space="preserve"> </w:t>
-      </w:r>
-      <w:hyperlink r:id="rId89">
-        <w:r>
-          <w:rPr>
-            <w:rStyle w:val="Hyperlink"/>
-          </w:rPr>
-          <w:t xml:space="preserve">who won 2nd</w:t>
-        </w:r>
-      </w:hyperlink>
-      <w:r>
-        <w:t xml:space="preserve"> </w:t>
-      </w:r>
-      <w:r>
-        <w:t xml:space="preserve">place in SRC ESEC/FSE ’19.</w:t>
-      </w:r>
+      <w:hyperlink r:id="rId90">
+        <w:r>
+          <w:rPr>
+            <w:rStyle w:val="Hyperlink"/>
+          </w:rPr>
+          <w:t xml:space="preserve">Arctic Code Vault Contributor</w:t>
+        </w:r>
+      </w:hyperlink>
     </w:p>
     <w:p>
       <w:pPr>
@@ -1968,7 +1991,24 @@
         </w:numPr>
       </w:pPr>
       <w:r>
-        <w:t xml:space="preserve">Best paper award from the 15th Annual DMST Student Conference (2018)</w:t>
+        <w:t xml:space="preserve">Mentored younger researcher</w:t>
+      </w:r>
+      <w:r>
+        <w:t xml:space="preserve"> </w:t>
+      </w:r>
+      <w:hyperlink r:id="rId91">
+        <w:r>
+          <w:rPr>
+            <w:rStyle w:val="Hyperlink"/>
+          </w:rPr>
+          <w:t xml:space="preserve">who won 2nd place</w:t>
+        </w:r>
+      </w:hyperlink>
+      <w:r>
+        <w:t xml:space="preserve"> </w:t>
+      </w:r>
+      <w:r>
+        <w:t xml:space="preserve">in SRC ESEC/FSE ’19.</w:t>
       </w:r>
     </w:p>
     <w:p>
@@ -1980,24 +2020,7 @@
         </w:numPr>
       </w:pPr>
       <w:r>
-        <w:t xml:space="preserve">Marie Skłodowska-Curie funds,</w:t>
-      </w:r>
-      <w:r>
-        <w:t xml:space="preserve"> </w:t>
-      </w:r>
-      <w:hyperlink r:id="rId90">
-        <w:r>
-          <w:rPr>
-            <w:rStyle w:val="Hyperlink"/>
-          </w:rPr>
-          <w:t xml:space="preserve">SENECA</w:t>
-        </w:r>
-      </w:hyperlink>
-      <w:r>
-        <w:t xml:space="preserve"> </w:t>
-      </w:r>
-      <w:r>
-        <w:t xml:space="preserve">(2016-2019)</w:t>
+        <w:t xml:space="preserve">Best paper award from the 15th Annual DMST Student Conference (2018)</w:t>
       </w:r>
     </w:p>
     <w:p>
@@ -2009,6 +2032,35 @@
         </w:numPr>
       </w:pPr>
       <w:r>
+        <w:t xml:space="preserve">Marie Skłodowska-Curie funds,</w:t>
+      </w:r>
+      <w:r>
+        <w:t xml:space="preserve"> </w:t>
+      </w:r>
+      <w:hyperlink r:id="rId92">
+        <w:r>
+          <w:rPr>
+            <w:rStyle w:val="Hyperlink"/>
+          </w:rPr>
+          <w:t xml:space="preserve">SENECA</w:t>
+        </w:r>
+      </w:hyperlink>
+      <w:r>
+        <w:t xml:space="preserve"> </w:t>
+      </w:r>
+      <w:r>
+        <w:t xml:space="preserve">(2016-2019)</w:t>
+      </w:r>
+    </w:p>
+    <w:p>
+      <w:pPr>
+        <w:pStyle w:val="Compact"/>
+        <w:numPr>
+          <w:numId w:val="1005"/>
+          <w:ilvl w:val="1"/>
+        </w:numPr>
+      </w:pPr>
+      <w:r>
         <w:t xml:space="preserve">Erasmus Mundus Masters Scholarship, PERCCOM (2013-2015)</w:t>
       </w:r>
     </w:p>
@@ -2160,23 +2212,23 @@
       <w:pPr>
         <w:pStyle w:val="Heading2"/>
       </w:pPr>
-      <w:bookmarkStart w:id="91" w:name="my-academic-tree"/>
+      <w:bookmarkStart w:id="93" w:name="my-academic-tree"/>
       <w:r>
         <w:t xml:space="preserve">My Academic Tree</w:t>
       </w:r>
-      <w:bookmarkEnd w:id="91"/>
-    </w:p>
-    <w:p>
-      <w:pPr>
-        <w:pStyle w:val="Compact"/>
-      </w:pPr>
-    </w:p>
-    <w:p>
-      <w:pPr>
-        <w:pStyle w:val="Compact"/>
-      </w:pPr>
-      <w:r>
-        <w:t xml:space="preserve">Analyzing Repository</w:t>
+      <w:bookmarkEnd w:id="93"/>
+    </w:p>
+    <w:p>
+      <w:pPr>
+        <w:pStyle w:val="Compact"/>
+      </w:pPr>
+    </w:p>
+    <w:p>
+      <w:pPr>
+        <w:pStyle w:val="Compact"/>
+      </w:pPr>
+      <w:r>
+        <w:t xml:space="preserve">Zoom-in for more details</w:t>
       </w:r>
     </w:p>
     <w:p>

</xml_diff>